<commit_message>
Update ImpactGlobe and HeritageGuide backends to Firebase, clean repo
</commit_message>
<xml_diff>
--- a/Krish_Mistry_Resume.docx
+++ b/Krish_Mistry_Resume.docx
@@ -391,114 +391,34 @@
         </w:tabs>
         <w:spacing w:before="130" w:after="30"/>
       </w:pPr>
+      <w:r>
+        <w:t>ImpactGlobe   ( Next.js · TypeScript · Three.js · Firebase · Gemini AI · Vercel )</w:t>
+        <w:tab/>
+        <w:t xml:space="preserve"> 2026</w:t>
+      </w:r>
+    </w:p>
+    <w:p>
+      <w:pPr>
+        <w:pStyle w:val="ListParagraph"/>
+        <w:numPr>
+          <w:ilvl w:val="0"/>
+          <w:numId w:val="2"/>
+        </w:numPr>
+        <w:spacing w:before="28" w:after="28"/>
+      </w:pPr>
+      <w:r>
+        <w:t>Engineered a real-time geop</w:t>
+      </w:r>
+      <w:r>
+        <w:t>olitical and financial intelligence dashboard on a 3D interactive globe (Three.js + Leaflet) with 7 live environmental overlays — earthquakes, wildfires, AQI, and wind — via Open-</w:t>
+      </w:r>
       <w:proofErr w:type="spellStart"/>
       <w:r>
-        <w:rPr>
-          <w:b/>
-          <w:bCs/>
-          <w:sz w:val="22"/>
-          <w:szCs w:val="22"/>
-        </w:rPr>
-        <w:t>ImpactGlobe</w:t>
+        <w:t>Meteo</w:t>
       </w:r>
       <w:proofErr w:type="spellEnd"/>
-      <w:proofErr w:type="gramStart"/>
-      <w:r>
-        <w:rPr>
-          <w:color w:val="444444"/>
-        </w:rPr>
-        <w:t xml:space="preserve">  </w:t>
-      </w:r>
-      <w:r>
-        <w:rPr>
-          <w:color w:val="444444"/>
-        </w:rPr>
-        <w:t xml:space="preserve"> (</w:t>
-      </w:r>
-      <w:proofErr w:type="gramEnd"/>
-      <w:r>
-        <w:rPr>
-          <w:color w:val="444444"/>
-        </w:rPr>
-        <w:t xml:space="preserve"> </w:t>
-      </w:r>
-      <w:r>
-        <w:rPr>
-          <w:i/>
-          <w:iCs/>
-          <w:color w:val="444444"/>
-          <w:sz w:val="19"/>
-          <w:szCs w:val="19"/>
-        </w:rPr>
-        <w:t xml:space="preserve">Next.js · TypeScript · Three.js · </w:t>
-      </w:r>
-      <w:proofErr w:type="spellStart"/>
-      <w:r>
-        <w:rPr>
-          <w:i/>
-          <w:iCs/>
-          <w:color w:val="444444"/>
-          <w:sz w:val="19"/>
-          <w:szCs w:val="19"/>
-        </w:rPr>
-        <w:t>Supabase</w:t>
-      </w:r>
-      <w:proofErr w:type="spellEnd"/>
-      <w:r>
-        <w:rPr>
-          <w:i/>
-          <w:iCs/>
-          <w:color w:val="444444"/>
-          <w:sz w:val="19"/>
-          <w:szCs w:val="19"/>
-        </w:rPr>
-        <w:t xml:space="preserve"> · Gemini AI · </w:t>
-      </w:r>
-      <w:proofErr w:type="spellStart"/>
-      <w:r>
-        <w:rPr>
-          <w:i/>
-          <w:iCs/>
-          <w:color w:val="444444"/>
-          <w:sz w:val="19"/>
-          <w:szCs w:val="19"/>
-        </w:rPr>
-        <w:t>Vercel</w:t>
-      </w:r>
-      <w:proofErr w:type="spellEnd"/>
-      <w:r>
-        <w:rPr>
-          <w:i/>
-          <w:iCs/>
-          <w:color w:val="444444"/>
-          <w:sz w:val="19"/>
-          <w:szCs w:val="19"/>
-        </w:rPr>
-        <w:t xml:space="preserve"> )</w:t>
-      </w:r>
-      <w:r>
-        <w:rPr>
-          <w:color w:val="444444"/>
-        </w:rPr>
-        <w:tab/>
-      </w:r>
-      <w:r>
-        <w:rPr>
-          <w:color w:val="444444"/>
-        </w:rPr>
-        <w:t xml:space="preserve"> </w:t>
-      </w:r>
-      <w:r>
-        <w:rPr>
-          <w:color w:val="444444"/>
-        </w:rPr>
-        <w:t>20</w:t>
-      </w:r>
-      <w:r>
-        <w:rPr>
-          <w:color w:val="444444"/>
-        </w:rPr>
-        <w:t>26</w:t>
+      <w:r>
+        <w:t>, USGS, and NASA EONET APIs.</w:t>
       </w:r>
     </w:p>
     <w:p>
@@ -511,61 +431,7 @@
         <w:spacing w:before="28" w:after="28"/>
       </w:pPr>
       <w:r>
-        <w:t>Engineered a real-time geop</w:t>
-      </w:r>
-      <w:r>
-        <w:t>olitical and financial intelligence dashboard on a 3D interactive globe (Three.js + Leaflet) with 7 live environmental overlays — earthquakes, wildfires, AQI, and wind — via Open-</w:t>
-      </w:r>
-      <w:proofErr w:type="spellStart"/>
-      <w:r>
-        <w:t>Meteo</w:t>
-      </w:r>
-      <w:proofErr w:type="spellEnd"/>
-      <w:r>
-        <w:t>, USGS, and NASA EONET APIs.</w:t>
-      </w:r>
-    </w:p>
-    <w:p>
-      <w:pPr>
-        <w:pStyle w:val="ListParagraph"/>
-        <w:numPr>
-          <w:ilvl w:val="0"/>
-          <w:numId w:val="2"/>
-        </w:numPr>
-        <w:spacing w:before="28" w:after="28"/>
-      </w:pPr>
-      <w:r>
-        <w:t>I</w:t>
-      </w:r>
-      <w:r>
-        <w:t>ntegrated Google Gemini 2.0 Flash to auto-</w:t>
-      </w:r>
-      <w:r>
-        <w:t xml:space="preserve">generate structured geopolitical events with forex impact analysis every 4 hours; built live forex panel with Twelve Data API, </w:t>
-      </w:r>
-      <w:proofErr w:type="spellStart"/>
-      <w:r>
-        <w:t>Supabase</w:t>
-      </w:r>
-      <w:proofErr w:type="spellEnd"/>
-      <w:r>
-        <w:t xml:space="preserve"> Realtime push, and automated </w:t>
-      </w:r>
-      <w:proofErr w:type="spellStart"/>
-      <w:r>
-        <w:t>Vercel</w:t>
-      </w:r>
-      <w:proofErr w:type="spellEnd"/>
-      <w:r>
-        <w:t xml:space="preserve"> </w:t>
-      </w:r>
-      <w:proofErr w:type="spellStart"/>
-      <w:r>
-        <w:t>cron</w:t>
-      </w:r>
-      <w:proofErr w:type="spellEnd"/>
-      <w:r>
-        <w:t xml:space="preserve"> jobs.</w:t>
+        <w:t>Integrated Google Gemini 2.0 Flash to auto-generate structured geopolitical events with forex impact analysis every 4 hours; built live forex panel with Twelve Data API, Firebase Realtime Database, and automated Vercel cron jobs.</w:t>
       </w:r>
     </w:p>
     <w:p>
@@ -1069,67 +935,8 @@
         </w:tabs>
         <w:spacing w:before="130" w:after="30"/>
       </w:pPr>
-      <w:proofErr w:type="spellStart"/>
-      <w:r>
-        <w:rPr>
-          <w:b/>
-          <w:bCs/>
-          <w:sz w:val="22"/>
-          <w:szCs w:val="22"/>
-        </w:rPr>
-        <w:t>HeritageGuide</w:t>
-      </w:r>
-      <w:proofErr w:type="spellEnd"/>
-      <w:proofErr w:type="gramStart"/>
-      <w:r>
-        <w:rPr>
-          <w:color w:val="444444"/>
-        </w:rPr>
-        <w:t xml:space="preserve">  </w:t>
-      </w:r>
-      <w:r>
-        <w:rPr>
-          <w:color w:val="444444"/>
-        </w:rPr>
-        <w:t xml:space="preserve"> </w:t>
-      </w:r>
-      <w:r>
-        <w:rPr>
-          <w:color w:val="444444"/>
-        </w:rPr>
-        <w:t>(</w:t>
-      </w:r>
-      <w:proofErr w:type="gramEnd"/>
-      <w:r>
-        <w:rPr>
-          <w:color w:val="444444"/>
-        </w:rPr>
-        <w:t xml:space="preserve"> </w:t>
-      </w:r>
-      <w:r>
-        <w:rPr>
-          <w:i/>
-          <w:iCs/>
-          <w:color w:val="444444"/>
-          <w:sz w:val="19"/>
-          <w:szCs w:val="19"/>
-        </w:rPr>
-        <w:t>Django 5 · Leaflet · OpenStreetMap · Google Maps API · SQLite</w:t>
-      </w:r>
-      <w:r>
-        <w:rPr>
-          <w:i/>
-          <w:iCs/>
-          <w:color w:val="444444"/>
-          <w:sz w:val="19"/>
-          <w:szCs w:val="19"/>
-        </w:rPr>
-        <w:t xml:space="preserve"> )</w:t>
-      </w:r>
-      <w:r>
-        <w:rPr>
-          <w:color w:val="444444"/>
-        </w:rPr>
+      <w:r>
+        <w:t>HeritageGuide   ( Django 5 · Leaflet · OpenStreetMap · Google Maps API · Firebase )</w:t>
         <w:tab/>
         <w:t>2025</w:t>
       </w:r>

</xml_diff>